<commit_message>
Replace Georgetown Reddit project with AI-Assisted Prayer Requests platform
Co-Authored-By: Claude Sonnet 4.6 <noreply@anthropic.com>
</commit_message>
<xml_diff>
--- a/CV.docx
+++ b/CV.docx
@@ -817,16 +817,17 @@
           <w:sz-cs w:val="24"/>
           <w:b/>
         </w:rPr>
-        <w:t xml:space="preserve">Large-Scale Distributed NLP Analysis System</w:t>
-        <w:tab/>
-        <w:t xml:space="preserve">                                                                   Sep 2022 – Jan 2023</w:t>
-      </w:r>
-    </w:p>
-    <w:p>
-      <w:pPr/>
-      <w:r>
-        <w:rPr>
-          <w:rFonts w:ascii="Times" w:hAnsi="Times" w:cs="Times"/>
+        <w:t>AI-Assisted Prayer Requests Full-Stack Platform</w:t>
+        <w:tab/>
+        <w:t>May 2026</w:t>
+      </w:r>
+    </w:p>
+    <w:p>
+      <w:pPr/>
+      <w:r>
+        <w:rPr>
+          <w:rFonts w:ascii="Times" w:hAnsi="Times" w:cs="Times"/>
+          <w:b w:val="0"/>
           <w:sz w:val="24"/>
           <w:sz-cs w:val="24"/>
         </w:rPr>
@@ -839,58 +840,58 @@
           <w:sz-cs w:val="24"/>
           <w:b/>
         </w:rPr>
-        <w:t xml:space="preserve">Python · AWS EC2/EMR · Spark · Hadoop · Scikit-learn</w:t>
-      </w:r>
-    </w:p>
-    <w:p>
-      <w:pPr>
-        <w:ind w:left="720" w:first-line="-720"/>
-      </w:pPr>
-      <w:r>
-        <w:rPr>
-          <w:rFonts w:ascii="Times" w:hAnsi="Times" w:cs="Times"/>
-          <w:sz w:val="24"/>
-          <w:sz-cs w:val="24"/>
-        </w:rPr>
-        <w:t xml:space="preserve"/>
-        <w:tab/>
-        <w:t xml:space="preserve">•</w:t>
-        <w:tab/>
-        <w:t xml:space="preserve">Built a distributed NLP pipeline processing 21M+ Reddit comments to study topic-sentiment relationships.</w:t>
-      </w:r>
-    </w:p>
-    <w:p>
-      <w:pPr>
-        <w:ind w:left="720" w:first-line="-720"/>
-      </w:pPr>
-      <w:r>
-        <w:rPr>
-          <w:rFonts w:ascii="Times" w:hAnsi="Times" w:cs="Times"/>
-          <w:sz w:val="24"/>
-          <w:sz-cs w:val="24"/>
-        </w:rPr>
-        <w:t xml:space="preserve"/>
-        <w:tab/>
-        <w:t xml:space="preserve">•</w:t>
-        <w:tab/>
-        <w:t xml:space="preserve">Optimized Spark resource allocation (executor memory, parallelism) to improve throughput; designed scalable batch architecture on AWS EMR.</w:t>
-      </w:r>
-    </w:p>
-    <w:p>
-      <w:pPr>
-        <w:ind w:left="720" w:first-line="-720"/>
-      </w:pPr>
-      <w:r>
-        <w:rPr>
-          <w:rFonts w:ascii="Times" w:hAnsi="Times" w:cs="Times"/>
-          <w:sz w:val="24"/>
-          <w:sz-cs w:val="24"/>
-        </w:rPr>
-        <w:t xml:space="preserve"/>
-        <w:tab/>
-        <w:t xml:space="preserve">•</w:t>
-        <w:tab/>
-        <w:t xml:space="preserve">Trained and benchmarked GBDT and Random Forest models using Accuracy, Precision, Recall, and F1.</w:t>
+        <w:t>Next.js · React · TypeScript · Supabase · Resend · Vercel · GitHub Actions | App: https://prayer-web-eta.vercel.app/ | Intro: jianchengsun826.github.io/prayer-web/introduction.html</w:t>
+      </w:r>
+    </w:p>
+    <w:p>
+      <w:pPr>
+        <w:ind w:left="720" w:first-line="-720"/>
+      </w:pPr>
+      <w:r>
+        <w:rPr>
+          <w:rFonts w:ascii="Times" w:hAnsi="Times" w:cs="Times"/>
+          <w:b w:val="0"/>
+          <w:sz w:val="24"/>
+          <w:sz-cs w:val="24"/>
+        </w:rPr>
+        <w:tab/>
+        <w:t>•</w:t>
+        <w:tab/>
+        <w:t>Built a production-ready bilingual prayer request platform with auth, role-based admin access, prayer submission, category filtering, user account settings, and content management workflows.</w:t>
+      </w:r>
+    </w:p>
+    <w:p>
+      <w:pPr>
+        <w:ind w:left="720" w:first-line="-720"/>
+      </w:pPr>
+      <w:r>
+        <w:rPr>
+          <w:rFonts w:ascii="Times" w:hAnsi="Times" w:cs="Times"/>
+          <w:b w:val="0"/>
+          <w:sz w:val="24"/>
+          <w:sz-cs w:val="24"/>
+        </w:rPr>
+        <w:tab/>
+        <w:t>•</w:t>
+        <w:tab/>
+        <w:t>Developed Supabase-backed server actions, admin APIs, email notification flows, scheduled expiry reminders, and static GitHub Pages documentation for end users.</w:t>
+      </w:r>
+    </w:p>
+    <w:p>
+      <w:pPr>
+        <w:ind w:left="720" w:first-line="-720"/>
+      </w:pPr>
+      <w:r>
+        <w:rPr>
+          <w:rFonts w:ascii="Times" w:hAnsi="Times" w:cs="Times"/>
+          <w:b w:val="0"/>
+          <w:sz w:val="24"/>
+          <w:sz-cs w:val="24"/>
+        </w:rPr>
+        <w:tab/>
+        <w:t>•</w:t>
+        <w:tab/>
+        <w:t>Delivered the full-stack application in one week using AI pair-programming to accelerate architecture planning, implementation, debugging, refactoring, and documentation, with quality enforced through ESLint, TypeScript, Vitest, and build verification.</w:t>
       </w:r>
     </w:p>
     <w:p>

</xml_diff>